<commit_message>
Add four follow-up questions and answers to interview transcript
Co-Authored-By: Claude <noreply@anthropic.com>
Claude-Session: https://claude.ai/code/session_018r6RLCeuZoV1c54nVo9fJU
</commit_message>
<xml_diff>
--- a/interview/interview-transcript.docx
+++ b/interview/interview-transcript.docx
@@ -357,6 +357,60 @@
     <w:p>
       <w:pPr>
         <w:bidi/>
+        <w:spacing w:after="60" w:before="120" w:line="360"/>
+      </w:pPr>
+      <w:r>
+        <w:rPr>
+          <w:rFonts w:ascii="David" w:cs="David" w:eastAsia="David" w:hAnsi="David"/>
+          <w:b/>
+          <w:bCs/>
+          <w:sz w:val="24"/>
+          <w:szCs w:val="24"/>
+          <w:rtl/>
+        </w:rPr>
+        <w:t xml:space="preserve">מראיין: </w:t>
+      </w:r>
+      <w:r>
+        <w:rPr>
+          <w:rFonts w:ascii="David" w:cs="David" w:eastAsia="David" w:hAnsi="David"/>
+          <w:b/>
+          <w:bCs/>
+          <w:sz w:val="24"/>
+          <w:szCs w:val="24"/>
+          <w:rtl/>
+        </w:rPr>
+        <w:t xml:space="preserve">ספרי לי על שיתוף הפעולה בינך ובין שאר הצוות סביב התלמידים המשולבים.</w:t>
+      </w:r>
+    </w:p>
+    <w:p>
+      <w:pPr>
+        <w:bidi/>
+        <w:spacing w:after="240" w:line="360"/>
+      </w:pPr>
+      <w:r>
+        <w:rPr>
+          <w:rFonts w:ascii="David" w:cs="David" w:eastAsia="David" w:hAnsi="David"/>
+          <w:b/>
+          <w:bCs/>
+          <w:sz w:val="24"/>
+          <w:szCs w:val="24"/>
+          <w:rtl/>
+        </w:rPr>
+        <w:t xml:space="preserve">מרואיינת: </w:t>
+      </w:r>
+      <w:r>
+        <w:rPr>
+          <w:rFonts w:ascii="David" w:cs="David" w:eastAsia="David" w:hAnsi="David"/>
+          <w:sz w:val="24"/>
+          <w:szCs w:val="24"/>
+          <w:rtl/>
+        </w:rPr>
+        <w:t xml:space="preserve">על הנייר יש סביב הילדים האלה צוות שלם: סייעת, מורת שילוב, יועצת, רכזת השתלבות, וישיבת צוות רב־מקצועי פעם בחודש. בפועל, שיתוף הפעולה האמיתי קורה בדקות שבין הדברים. עם הסייעת אין לי אף שעה משותפת במערכת, אז אנחנו מדברות בהפסקות, ובערב בווטסאפ, על מה היה היום ומה צפוי מחר. עם מורת השילוב יש לי חצי שעה קבועה ביום שלישי, וזו חצי השעה הכי חשובה בשבוע שלי. אנחנו עוברות ילד ילד, מה עבד ומה לא. עם היועצת אני מדברת בעיקר סביב משברים. הנקודה החלשה היא המורות המקצועיות. מורה שנכנסת לכיתה לשעתיים בשבוע לא תמיד יודעת בכלל מה הצרכים, והיה מקרה שמורה חדשה כעסה על סאלם וחשבה שהוא חצוף, כשהוא בסך הכול ענה לה בדיוק את מה שחשב, כי ככה הוא בנוי. אחרי המקרה ההוא הכנתי דף אחד על כל ילד משולב, "מה עוזר לו ומה מפרק אותו", וכל מורה שנכנסת לכיתה מקבלת אותו. ועם מי אני מתייעצת כשקשה באמת? עם מורת השילוב, ועם מחנכת ותיקה אחת שהיא בשבילי כתובת לכל דבר. לפעמים שיחה של חמש דקות במסדרון שווה יותר מכל הישיבות.</w:t>
+      </w:r>
+    </w:p>
+    <w:p>
+      <w:pPr>
+        <w:bidi/>
         <w:spacing w:after="120" w:before="240" w:line="360"/>
       </w:pPr>
       <w:r>
@@ -537,6 +591,60 @@
     <w:p>
       <w:pPr>
         <w:bidi/>
+        <w:spacing w:after="60" w:before="120" w:line="360"/>
+      </w:pPr>
+      <w:r>
+        <w:rPr>
+          <w:rFonts w:ascii="David" w:cs="David" w:eastAsia="David" w:hAnsi="David"/>
+          <w:b/>
+          <w:bCs/>
+          <w:sz w:val="24"/>
+          <w:szCs w:val="24"/>
+          <w:rtl/>
+        </w:rPr>
+        <w:t xml:space="preserve">מראיין: </w:t>
+      </w:r>
+      <w:r>
+        <w:rPr>
+          <w:rFonts w:ascii="David" w:cs="David" w:eastAsia="David" w:hAnsi="David"/>
+          <w:b/>
+          <w:bCs/>
+          <w:sz w:val="24"/>
+          <w:szCs w:val="24"/>
+          <w:rtl/>
+        </w:rPr>
+        <w:t xml:space="preserve">איך ילדי הכיתה מתייחסים לתלמידים המשולבים, מניסיונך?</w:t>
+      </w:r>
+    </w:p>
+    <w:p>
+      <w:pPr>
+        <w:bidi/>
+        <w:spacing w:after="240" w:line="360"/>
+      </w:pPr>
+      <w:r>
+        <w:rPr>
+          <w:rFonts w:ascii="David" w:cs="David" w:eastAsia="David" w:hAnsi="David"/>
+          <w:b/>
+          <w:bCs/>
+          <w:sz w:val="24"/>
+          <w:szCs w:val="24"/>
+          <w:rtl/>
+        </w:rPr>
+        <w:t xml:space="preserve">מרואיינת: </w:t>
+      </w:r>
+      <w:r>
+        <w:rPr>
+          <w:rFonts w:ascii="David" w:cs="David" w:eastAsia="David" w:hAnsi="David"/>
+          <w:sz w:val="24"/>
+          <w:szCs w:val="24"/>
+          <w:rtl/>
+        </w:rPr>
+        <w:t xml:space="preserve">אני יכולה לחלק את הכיתה לשלושה מעגלים. יש מעגל קטן של חברים אמיתיים, כמו עומר של סאלם, ילדים שבחרו בקשר הזה בעצמם. יש את הרוב, ילדים נחמדים אבל אדישים, כאלה שלא יפגעו אף פעם אבל גם לא יזמינו הביתה. ויש שניים שלושה שמחפשים את הרגע שבו אין מבוגר בסביבה. המצב שהכי ממחיש את זה קרה בשנה שעברה, ביום שהייתי חולה והגיעה מורה ממלאת מקום. חזרתי למחרת, ושלוש בנות חיכו לי ליד הדלת לפני הצלצול כדי לספר שילד אחד חיקה את סאלם מול כולם, ושהן אמרו לו להפסיק והוא לא הפסיק. מה שעניין אותי היה לא החיקוי עצמו, את זה כבר הכרתי. עניין אותי שהיו ילדים שזה הפריע להם מספיק כדי להתעמת איתו, ואחר כך לבוא לספר לי. לפני שלוש שנים אף אחד לא היה אומר מילה. עם אמל התמונה אחרת, כמו שסיפרתי, עוטפים אותה אבל לא רואים בה שווה. ומה שלמדתי לאורך הזמן הוא שהילדים בסך הכול מחקים אותנו. כיתה שרואה מורה שמכבדת, לומדת לכבד. זה לא קסם וזה לא מהיר, אבל זה עובד.</w:t>
+      </w:r>
+    </w:p>
+    <w:p>
+      <w:pPr>
+        <w:bidi/>
         <w:spacing w:after="120" w:before="240" w:line="360"/>
       </w:pPr>
       <w:r>
@@ -717,6 +825,60 @@
     <w:p>
       <w:pPr>
         <w:bidi/>
+        <w:spacing w:after="60" w:before="120" w:line="360"/>
+      </w:pPr>
+      <w:r>
+        <w:rPr>
+          <w:rFonts w:ascii="David" w:cs="David" w:eastAsia="David" w:hAnsi="David"/>
+          <w:b/>
+          <w:bCs/>
+          <w:sz w:val="24"/>
+          <w:szCs w:val="24"/>
+          <w:rtl/>
+        </w:rPr>
+        <w:t xml:space="preserve">מראיין: </w:t>
+      </w:r>
+      <w:r>
+        <w:rPr>
+          <w:rFonts w:ascii="David" w:cs="David" w:eastAsia="David" w:hAnsi="David"/>
+          <w:b/>
+          <w:bCs/>
+          <w:sz w:val="24"/>
+          <w:szCs w:val="24"/>
+          <w:rtl/>
+        </w:rPr>
+        <w:t xml:space="preserve">ספרי לי על רגע עם תלמיד משולב שהפתיע אותך.</w:t>
+      </w:r>
+    </w:p>
+    <w:p>
+      <w:pPr>
+        <w:bidi/>
+        <w:spacing w:after="240" w:line="360"/>
+      </w:pPr>
+      <w:r>
+        <w:rPr>
+          <w:rFonts w:ascii="David" w:cs="David" w:eastAsia="David" w:hAnsi="David"/>
+          <w:b/>
+          <w:bCs/>
+          <w:sz w:val="24"/>
+          <w:szCs w:val="24"/>
+          <w:rtl/>
+        </w:rPr>
+        <w:t xml:space="preserve">מרואיינת: </w:t>
+      </w:r>
+      <w:r>
+        <w:rPr>
+          <w:rFonts w:ascii="David" w:cs="David" w:eastAsia="David" w:hAnsi="David"/>
+          <w:sz w:val="24"/>
+          <w:szCs w:val="24"/>
+          <w:rtl/>
+        </w:rPr>
+        <w:t xml:space="preserve">היה רגע אחד השנה שאני עדיין חושבת עליו. יש לי בכיתה ילד דומיננטי מאוד, נקרא לו ראמי, מהילדים שמנהלים את החצר. לפני כמה חודשים נפטר סבא שלו. הוא חזר לבית הספר אחרי שבוע, ובאמצע שיעור חשבון פשוט התחיל לבכות, בשקט, לתוך השרוול. הכיתה קפאה. אף אחד לא ידע מה לעשות עם זה, ילדים לא רגילים לראות את החזק בוכה. ומי שקמה הייתה אמל. היא לקחה את בקבוק המים שלה, שמה לו על השולחן, והתיישבה על הכיסא שלידו. בלי מילה אחת. היא ישבה שם עד סוף השיעור. אחר כך שאלתי אותה איך ידעה מה לעשות, והיא משכה בכתפיים ואמרה: "ככה אני רוצה שיעשו לי כשאני עצובה". זה הפתיע אותי כי בלי לשים לב שיבצתי אותה בראש שלי בתפקיד קבוע, זו שמקבלת עזרה. באותו רגע הבנתי שהיא אולי הילדה עם הידע הרגשי הכי עמוק בכיתה, בדיוק בגלל מה שהיא עברה בעצמה. מאז אני מחפשת בכוונה הזדמנויות להפוך את הכיוון, שהילדים המשולבים יהיו הנותנים, ולא רק המקבלים.</w:t>
+      </w:r>
+    </w:p>
+    <w:p>
+      <w:pPr>
+        <w:bidi/>
         <w:spacing w:after="120" w:before="240" w:line="360"/>
       </w:pPr>
       <w:r>
@@ -892,6 +1054,60 @@
           <w:rtl/>
         </w:rPr>
         <w:t xml:space="preserve">קודם כול המרחקים והתשתיות. יש לי תלמידים שמגיעים מכפרים לא מוכרים, שעה בהסעה לכל כיוון. ילד עם קשיי ויסות שמתחיל את היום אחרי שעה בהסעה צפופה מגיע אליי אחרי שכבר עבר את המלחמה הראשונה שלו. טיפולים רגשיים ופרא־רפואיים כמעט אין בסביבה, ומי שצריך קלינאית תקשורת או ריפוי בעיסוק נוסע לבאר שבע, אם יש רכב ואם יש תור, והתור לפעמים חצי שנה. דבר שני, השפה. אבחונים וכלים מגיעים בעברית, והורים חותמים על מסמכים שהם לא תמיד מבינים עד הסוף. דבר שלישי, הסטיגמה. מוגבלות אצלנו עדיין נקשרת לבושה משפחתית, ויש מי שמסתיר ילד כדי לא לפגוע בשידוכים של האחים. אבל אני רוצה להגיד גם את הצד השני, כי יש צד שני. החברה שלנו היא חברה של ערבות הדדית. ילדים גדלים במשפחות גדולות, רגילים לטפל בקטנים ובחלשים, ויש בהם רוך שאני לא בטוחה שקיים בכל מקום. וההורים הצעירים כבר אחרים. הם שואלים, קוראים, מגיעים לוועדות עם שאלות. אם הייתי יכולה לשנות דבר אחד, הייתי מביאה את השירותים אל הכפרים, בערבית, במקום לגרור את המשפחות אליהם. מרכז טיפולי אחד בכפר שווה יותר מעשר תוכניות במחוז.</w:t>
+      </w:r>
+    </w:p>
+    <w:p>
+      <w:pPr>
+        <w:bidi/>
+        <w:spacing w:after="60" w:before="120" w:line="360"/>
+      </w:pPr>
+      <w:r>
+        <w:rPr>
+          <w:rFonts w:ascii="David" w:cs="David" w:eastAsia="David" w:hAnsi="David"/>
+          <w:b/>
+          <w:bCs/>
+          <w:sz w:val="24"/>
+          <w:szCs w:val="24"/>
+          <w:rtl/>
+        </w:rPr>
+        <w:t xml:space="preserve">מראיין: </w:t>
+      </w:r>
+      <w:r>
+        <w:rPr>
+          <w:rFonts w:ascii="David" w:cs="David" w:eastAsia="David" w:hAnsi="David"/>
+          <w:b/>
+          <w:bCs/>
+          <w:sz w:val="24"/>
+          <w:szCs w:val="24"/>
+          <w:rtl/>
+        </w:rPr>
+        <w:t xml:space="preserve">מה היית אומרת למורה שמתחילה עכשיו ללמד בכיתה משלבת?</w:t>
+      </w:r>
+    </w:p>
+    <w:p>
+      <w:pPr>
+        <w:bidi/>
+        <w:spacing w:after="240" w:line="360"/>
+      </w:pPr>
+      <w:r>
+        <w:rPr>
+          <w:rFonts w:ascii="David" w:cs="David" w:eastAsia="David" w:hAnsi="David"/>
+          <w:b/>
+          <w:bCs/>
+          <w:sz w:val="24"/>
+          <w:szCs w:val="24"/>
+          <w:rtl/>
+        </w:rPr>
+        <w:t xml:space="preserve">מרואיינת: </w:t>
+      </w:r>
+      <w:r>
+        <w:rPr>
+          <w:rFonts w:ascii="David" w:cs="David" w:eastAsia="David" w:hAnsi="David"/>
+          <w:sz w:val="24"/>
+          <w:szCs w:val="24"/>
+          <w:rtl/>
+        </w:rPr>
+        <w:t xml:space="preserve">הדבר הראשון שהייתי אומרת לה: תורידי את הציפייה שזה יסתדר עד חנוכה. אצלי לקח שנתיים עד שלסאלם היה חבר אמיתי, וכל מי שמבטיח קיצור דרך פשוט לא היה בכיתה כזאת. הדבר השני, אל תישארי לבד. כבר בשבוע הראשון תמצאי לך מורת שילוב אחת ומחנכת ותיקה אחת, ותשאלי כל שאלה, כולל המביכות. אני בזבזתי שנה שלמה על להעמיד פנים שאני מסתדרת. הדבר השלישי, וזה משהו שלמדתי רק מהניסיון: ההפסקה חשובה מהשיעור. תצאי לחצר, תסתכלי מי משחק עם מי ומי עומד ליד הגדר. שם נמצא כל המידע שאת צריכה. ועוד משהו שלמדתי בדרך הקשה: התנהגות של ילד היא לא נגדך. ילד שהופך שולחן לא מורד בך, הוא טובע, ואת כרגע המצילה הכי קרובה אליו. אם תיקחי את זה אישית, תישרפי עד פורים. והדבר האחרון, תכתבי לעצמך את ההצלחות הקטנות. יום שבו ילד אמר "אנחנו", יום שבו שמרו לו כיסא. בימים הקשים, והם יגיעו, המחברת הזאת היא מה שיחזיק אותך. זו עבודה ששוחקת, אבל אני לא מכירה עבודה שנותנת יותר.</w:t>
       </w:r>
     </w:p>
     <w:p>

</xml_diff>

<commit_message>
Fix RTL direction: explicit right alignment and section-level bidi
Co-Authored-By: Claude <noreply@anthropic.com>
Claude-Session: https://claude.ai/code/session_018r6RLCeuZoV1c54nVo9fJU
</commit_message>
<xml_diff>
--- a/interview/interview-transcript.docx
+++ b/interview/interview-transcript.docx
@@ -40,6 +40,7 @@
       <w:pPr>
         <w:bidi/>
         <w:spacing w:after="60" w:line="360"/>
+        <w:jc w:val="right"/>
       </w:pPr>
       <w:r>
         <w:rPr>
@@ -57,6 +58,7 @@
       <w:pPr>
         <w:bidi/>
         <w:spacing w:after="60" w:line="360"/>
+        <w:jc w:val="right"/>
       </w:pPr>
       <w:r>
         <w:rPr>
@@ -74,6 +76,7 @@
       <w:pPr>
         <w:bidi/>
         <w:spacing w:after="60" w:line="360"/>
+        <w:jc w:val="right"/>
       </w:pPr>
       <w:r>
         <w:rPr>
@@ -91,6 +94,7 @@
       <w:pPr>
         <w:bidi/>
         <w:spacing w:after="120"/>
+        <w:jc w:val="right"/>
       </w:pPr>
       <w:r>
         <w:rPr>
@@ -106,6 +110,7 @@
       <w:pPr>
         <w:bidi/>
         <w:spacing w:after="120" w:before="240" w:line="360"/>
+        <w:jc w:val="right"/>
       </w:pPr>
       <w:r>
         <w:rPr>
@@ -124,6 +129,7 @@
       <w:pPr>
         <w:bidi/>
         <w:spacing w:after="60" w:before="120" w:line="360"/>
+        <w:jc w:val="right"/>
       </w:pPr>
       <w:r>
         <w:rPr>
@@ -152,6 +158,7 @@
       <w:pPr>
         <w:bidi/>
         <w:spacing w:after="240" w:line="360"/>
+        <w:jc w:val="right"/>
       </w:pPr>
       <w:r>
         <w:rPr>
@@ -178,6 +185,7 @@
       <w:pPr>
         <w:bidi/>
         <w:spacing w:after="120" w:before="240" w:line="360"/>
+        <w:jc w:val="right"/>
       </w:pPr>
       <w:r>
         <w:rPr>
@@ -196,6 +204,7 @@
       <w:pPr>
         <w:bidi/>
         <w:spacing w:after="60" w:before="120" w:line="360"/>
+        <w:jc w:val="right"/>
       </w:pPr>
       <w:r>
         <w:rPr>
@@ -224,6 +233,7 @@
       <w:pPr>
         <w:bidi/>
         <w:spacing w:after="240" w:line="360"/>
+        <w:jc w:val="right"/>
       </w:pPr>
       <w:r>
         <w:rPr>
@@ -250,6 +260,7 @@
       <w:pPr>
         <w:bidi/>
         <w:spacing w:after="60" w:before="120" w:line="360"/>
+        <w:jc w:val="right"/>
       </w:pPr>
       <w:r>
         <w:rPr>
@@ -278,6 +289,7 @@
       <w:pPr>
         <w:bidi/>
         <w:spacing w:after="240" w:line="360"/>
+        <w:jc w:val="right"/>
       </w:pPr>
       <w:r>
         <w:rPr>
@@ -304,6 +316,7 @@
       <w:pPr>
         <w:bidi/>
         <w:spacing w:after="60" w:before="120" w:line="360"/>
+        <w:jc w:val="right"/>
       </w:pPr>
       <w:r>
         <w:rPr>
@@ -332,6 +345,7 @@
       <w:pPr>
         <w:bidi/>
         <w:spacing w:after="240" w:line="360"/>
+        <w:jc w:val="right"/>
       </w:pPr>
       <w:r>
         <w:rPr>
@@ -358,6 +372,7 @@
       <w:pPr>
         <w:bidi/>
         <w:spacing w:after="60" w:before="120" w:line="360"/>
+        <w:jc w:val="right"/>
       </w:pPr>
       <w:r>
         <w:rPr>
@@ -386,6 +401,7 @@
       <w:pPr>
         <w:bidi/>
         <w:spacing w:after="240" w:line="360"/>
+        <w:jc w:val="right"/>
       </w:pPr>
       <w:r>
         <w:rPr>
@@ -412,6 +428,7 @@
       <w:pPr>
         <w:bidi/>
         <w:spacing w:after="120" w:before="240" w:line="360"/>
+        <w:jc w:val="right"/>
       </w:pPr>
       <w:r>
         <w:rPr>
@@ -430,6 +447,7 @@
       <w:pPr>
         <w:bidi/>
         <w:spacing w:after="60" w:before="120" w:line="360"/>
+        <w:jc w:val="right"/>
       </w:pPr>
       <w:r>
         <w:rPr>
@@ -458,6 +476,7 @@
       <w:pPr>
         <w:bidi/>
         <w:spacing w:after="240" w:line="360"/>
+        <w:jc w:val="right"/>
       </w:pPr>
       <w:r>
         <w:rPr>
@@ -484,6 +503,7 @@
       <w:pPr>
         <w:bidi/>
         <w:spacing w:after="60" w:before="120" w:line="360"/>
+        <w:jc w:val="right"/>
       </w:pPr>
       <w:r>
         <w:rPr>
@@ -512,6 +532,7 @@
       <w:pPr>
         <w:bidi/>
         <w:spacing w:after="240" w:line="360"/>
+        <w:jc w:val="right"/>
       </w:pPr>
       <w:r>
         <w:rPr>
@@ -538,6 +559,7 @@
       <w:pPr>
         <w:bidi/>
         <w:spacing w:after="60" w:before="120" w:line="360"/>
+        <w:jc w:val="right"/>
       </w:pPr>
       <w:r>
         <w:rPr>
@@ -566,6 +588,7 @@
       <w:pPr>
         <w:bidi/>
         <w:spacing w:after="240" w:line="360"/>
+        <w:jc w:val="right"/>
       </w:pPr>
       <w:r>
         <w:rPr>
@@ -592,6 +615,7 @@
       <w:pPr>
         <w:bidi/>
         <w:spacing w:after="60" w:before="120" w:line="360"/>
+        <w:jc w:val="right"/>
       </w:pPr>
       <w:r>
         <w:rPr>
@@ -620,6 +644,7 @@
       <w:pPr>
         <w:bidi/>
         <w:spacing w:after="240" w:line="360"/>
+        <w:jc w:val="right"/>
       </w:pPr>
       <w:r>
         <w:rPr>
@@ -646,6 +671,7 @@
       <w:pPr>
         <w:bidi/>
         <w:spacing w:after="120" w:before="240" w:line="360"/>
+        <w:jc w:val="right"/>
       </w:pPr>
       <w:r>
         <w:rPr>
@@ -664,6 +690,7 @@
       <w:pPr>
         <w:bidi/>
         <w:spacing w:after="60" w:before="120" w:line="360"/>
+        <w:jc w:val="right"/>
       </w:pPr>
       <w:r>
         <w:rPr>
@@ -692,6 +719,7 @@
       <w:pPr>
         <w:bidi/>
         <w:spacing w:after="240" w:line="360"/>
+        <w:jc w:val="right"/>
       </w:pPr>
       <w:r>
         <w:rPr>
@@ -718,6 +746,7 @@
       <w:pPr>
         <w:bidi/>
         <w:spacing w:after="60" w:before="120" w:line="360"/>
+        <w:jc w:val="right"/>
       </w:pPr>
       <w:r>
         <w:rPr>
@@ -746,6 +775,7 @@
       <w:pPr>
         <w:bidi/>
         <w:spacing w:after="240" w:line="360"/>
+        <w:jc w:val="right"/>
       </w:pPr>
       <w:r>
         <w:rPr>
@@ -772,6 +802,7 @@
       <w:pPr>
         <w:bidi/>
         <w:spacing w:after="60" w:before="120" w:line="360"/>
+        <w:jc w:val="right"/>
       </w:pPr>
       <w:r>
         <w:rPr>
@@ -800,6 +831,7 @@
       <w:pPr>
         <w:bidi/>
         <w:spacing w:after="240" w:line="360"/>
+        <w:jc w:val="right"/>
       </w:pPr>
       <w:r>
         <w:rPr>
@@ -826,6 +858,7 @@
       <w:pPr>
         <w:bidi/>
         <w:spacing w:after="60" w:before="120" w:line="360"/>
+        <w:jc w:val="right"/>
       </w:pPr>
       <w:r>
         <w:rPr>
@@ -854,6 +887,7 @@
       <w:pPr>
         <w:bidi/>
         <w:spacing w:after="240" w:line="360"/>
+        <w:jc w:val="right"/>
       </w:pPr>
       <w:r>
         <w:rPr>
@@ -880,6 +914,7 @@
       <w:pPr>
         <w:bidi/>
         <w:spacing w:after="120" w:before="240" w:line="360"/>
+        <w:jc w:val="right"/>
       </w:pPr>
       <w:r>
         <w:rPr>
@@ -898,6 +933,7 @@
       <w:pPr>
         <w:bidi/>
         <w:spacing w:after="60" w:before="120" w:line="360"/>
+        <w:jc w:val="right"/>
       </w:pPr>
       <w:r>
         <w:rPr>
@@ -926,6 +962,7 @@
       <w:pPr>
         <w:bidi/>
         <w:spacing w:after="240" w:line="360"/>
+        <w:jc w:val="right"/>
       </w:pPr>
       <w:r>
         <w:rPr>
@@ -952,6 +989,7 @@
       <w:pPr>
         <w:bidi/>
         <w:spacing w:after="60" w:before="120" w:line="360"/>
+        <w:jc w:val="right"/>
       </w:pPr>
       <w:r>
         <w:rPr>
@@ -980,6 +1018,7 @@
       <w:pPr>
         <w:bidi/>
         <w:spacing w:after="240" w:line="360"/>
+        <w:jc w:val="right"/>
       </w:pPr>
       <w:r>
         <w:rPr>
@@ -1006,6 +1045,7 @@
       <w:pPr>
         <w:bidi/>
         <w:spacing w:after="60" w:before="120" w:line="360"/>
+        <w:jc w:val="right"/>
       </w:pPr>
       <w:r>
         <w:rPr>
@@ -1034,6 +1074,7 @@
       <w:pPr>
         <w:bidi/>
         <w:spacing w:after="240" w:line="360"/>
+        <w:jc w:val="right"/>
       </w:pPr>
       <w:r>
         <w:rPr>
@@ -1060,6 +1101,7 @@
       <w:pPr>
         <w:bidi/>
         <w:spacing w:after="60" w:before="120" w:line="360"/>
+        <w:jc w:val="right"/>
       </w:pPr>
       <w:r>
         <w:rPr>
@@ -1088,6 +1130,7 @@
       <w:pPr>
         <w:bidi/>
         <w:spacing w:after="240" w:line="360"/>
+        <w:jc w:val="right"/>
       </w:pPr>
       <w:r>
         <w:rPr>
@@ -1114,6 +1157,7 @@
       <w:pPr>
         <w:bidi/>
         <w:spacing w:after="120" w:before="240" w:line="360"/>
+        <w:jc w:val="right"/>
       </w:pPr>
       <w:r>
         <w:rPr>
@@ -1132,6 +1176,7 @@
       <w:pPr>
         <w:bidi/>
         <w:spacing w:after="60" w:before="120" w:line="360"/>
+        <w:jc w:val="right"/>
       </w:pPr>
       <w:r>
         <w:rPr>
@@ -1160,6 +1205,7 @@
       <w:pPr>
         <w:bidi/>
         <w:spacing w:after="240" w:line="360"/>
+        <w:jc w:val="right"/>
       </w:pPr>
       <w:r>
         <w:rPr>
@@ -1186,6 +1232,7 @@
       <w:pgSz w:w="11906" w:h="16838" w:orient="portrait"/>
       <w:pgMar w:top="1417" w:right="1417" w:bottom="1417" w:left="1417" w:header="708" w:footer="708" w:gutter="0"/>
       <w:pgNumType/>
+      <w:bidi/>
       <w:docGrid w:linePitch="360"/>
     </w:sectPr>
   </w:body>

</xml_diff>

<commit_message>
Justify body paragraphs in interview transcript
Co-Authored-By: Claude <noreply@anthropic.com>
Claude-Session: https://claude.ai/code/session_018r6RLCeuZoV1c54nVo9fJU
</commit_message>
<xml_diff>
--- a/interview/interview-transcript.docx
+++ b/interview/interview-transcript.docx
@@ -40,7 +40,7 @@
       <w:pPr>
         <w:bidi/>
         <w:spacing w:after="60" w:line="360"/>
-        <w:jc w:val="right"/>
+        <w:jc w:val="both"/>
       </w:pPr>
       <w:r>
         <w:rPr>
@@ -58,7 +58,7 @@
       <w:pPr>
         <w:bidi/>
         <w:spacing w:after="60" w:line="360"/>
-        <w:jc w:val="right"/>
+        <w:jc w:val="both"/>
       </w:pPr>
       <w:r>
         <w:rPr>
@@ -76,7 +76,7 @@
       <w:pPr>
         <w:bidi/>
         <w:spacing w:after="60" w:line="360"/>
-        <w:jc w:val="right"/>
+        <w:jc w:val="both"/>
       </w:pPr>
       <w:r>
         <w:rPr>
@@ -94,7 +94,7 @@
       <w:pPr>
         <w:bidi/>
         <w:spacing w:after="120"/>
-        <w:jc w:val="right"/>
+        <w:jc w:val="both"/>
       </w:pPr>
       <w:r>
         <w:rPr>
@@ -110,7 +110,7 @@
       <w:pPr>
         <w:bidi/>
         <w:spacing w:after="120" w:before="240" w:line="360"/>
-        <w:jc w:val="right"/>
+        <w:jc w:val="both"/>
       </w:pPr>
       <w:r>
         <w:rPr>
@@ -129,7 +129,7 @@
       <w:pPr>
         <w:bidi/>
         <w:spacing w:after="60" w:before="120" w:line="360"/>
-        <w:jc w:val="right"/>
+        <w:jc w:val="both"/>
       </w:pPr>
       <w:r>
         <w:rPr>
@@ -158,7 +158,7 @@
       <w:pPr>
         <w:bidi/>
         <w:spacing w:after="240" w:line="360"/>
-        <w:jc w:val="right"/>
+        <w:jc w:val="both"/>
       </w:pPr>
       <w:r>
         <w:rPr>
@@ -185,7 +185,7 @@
       <w:pPr>
         <w:bidi/>
         <w:spacing w:after="120" w:before="240" w:line="360"/>
-        <w:jc w:val="right"/>
+        <w:jc w:val="both"/>
       </w:pPr>
       <w:r>
         <w:rPr>
@@ -204,7 +204,7 @@
       <w:pPr>
         <w:bidi/>
         <w:spacing w:after="60" w:before="120" w:line="360"/>
-        <w:jc w:val="right"/>
+        <w:jc w:val="both"/>
       </w:pPr>
       <w:r>
         <w:rPr>
@@ -233,7 +233,7 @@
       <w:pPr>
         <w:bidi/>
         <w:spacing w:after="240" w:line="360"/>
-        <w:jc w:val="right"/>
+        <w:jc w:val="both"/>
       </w:pPr>
       <w:r>
         <w:rPr>
@@ -260,7 +260,7 @@
       <w:pPr>
         <w:bidi/>
         <w:spacing w:after="60" w:before="120" w:line="360"/>
-        <w:jc w:val="right"/>
+        <w:jc w:val="both"/>
       </w:pPr>
       <w:r>
         <w:rPr>
@@ -289,7 +289,7 @@
       <w:pPr>
         <w:bidi/>
         <w:spacing w:after="240" w:line="360"/>
-        <w:jc w:val="right"/>
+        <w:jc w:val="both"/>
       </w:pPr>
       <w:r>
         <w:rPr>
@@ -316,7 +316,7 @@
       <w:pPr>
         <w:bidi/>
         <w:spacing w:after="60" w:before="120" w:line="360"/>
-        <w:jc w:val="right"/>
+        <w:jc w:val="both"/>
       </w:pPr>
       <w:r>
         <w:rPr>
@@ -345,7 +345,7 @@
       <w:pPr>
         <w:bidi/>
         <w:spacing w:after="240" w:line="360"/>
-        <w:jc w:val="right"/>
+        <w:jc w:val="both"/>
       </w:pPr>
       <w:r>
         <w:rPr>
@@ -372,7 +372,7 @@
       <w:pPr>
         <w:bidi/>
         <w:spacing w:after="60" w:before="120" w:line="360"/>
-        <w:jc w:val="right"/>
+        <w:jc w:val="both"/>
       </w:pPr>
       <w:r>
         <w:rPr>
@@ -401,7 +401,7 @@
       <w:pPr>
         <w:bidi/>
         <w:spacing w:after="240" w:line="360"/>
-        <w:jc w:val="right"/>
+        <w:jc w:val="both"/>
       </w:pPr>
       <w:r>
         <w:rPr>
@@ -428,7 +428,7 @@
       <w:pPr>
         <w:bidi/>
         <w:spacing w:after="120" w:before="240" w:line="360"/>
-        <w:jc w:val="right"/>
+        <w:jc w:val="both"/>
       </w:pPr>
       <w:r>
         <w:rPr>
@@ -447,7 +447,7 @@
       <w:pPr>
         <w:bidi/>
         <w:spacing w:after="60" w:before="120" w:line="360"/>
-        <w:jc w:val="right"/>
+        <w:jc w:val="both"/>
       </w:pPr>
       <w:r>
         <w:rPr>
@@ -476,7 +476,7 @@
       <w:pPr>
         <w:bidi/>
         <w:spacing w:after="240" w:line="360"/>
-        <w:jc w:val="right"/>
+        <w:jc w:val="both"/>
       </w:pPr>
       <w:r>
         <w:rPr>
@@ -503,7 +503,7 @@
       <w:pPr>
         <w:bidi/>
         <w:spacing w:after="60" w:before="120" w:line="360"/>
-        <w:jc w:val="right"/>
+        <w:jc w:val="both"/>
       </w:pPr>
       <w:r>
         <w:rPr>
@@ -532,7 +532,7 @@
       <w:pPr>
         <w:bidi/>
         <w:spacing w:after="240" w:line="360"/>
-        <w:jc w:val="right"/>
+        <w:jc w:val="both"/>
       </w:pPr>
       <w:r>
         <w:rPr>
@@ -559,7 +559,7 @@
       <w:pPr>
         <w:bidi/>
         <w:spacing w:after="60" w:before="120" w:line="360"/>
-        <w:jc w:val="right"/>
+        <w:jc w:val="both"/>
       </w:pPr>
       <w:r>
         <w:rPr>
@@ -588,7 +588,7 @@
       <w:pPr>
         <w:bidi/>
         <w:spacing w:after="240" w:line="360"/>
-        <w:jc w:val="right"/>
+        <w:jc w:val="both"/>
       </w:pPr>
       <w:r>
         <w:rPr>
@@ -615,7 +615,7 @@
       <w:pPr>
         <w:bidi/>
         <w:spacing w:after="60" w:before="120" w:line="360"/>
-        <w:jc w:val="right"/>
+        <w:jc w:val="both"/>
       </w:pPr>
       <w:r>
         <w:rPr>
@@ -644,7 +644,7 @@
       <w:pPr>
         <w:bidi/>
         <w:spacing w:after="240" w:line="360"/>
-        <w:jc w:val="right"/>
+        <w:jc w:val="both"/>
       </w:pPr>
       <w:r>
         <w:rPr>
@@ -671,7 +671,7 @@
       <w:pPr>
         <w:bidi/>
         <w:spacing w:after="120" w:before="240" w:line="360"/>
-        <w:jc w:val="right"/>
+        <w:jc w:val="both"/>
       </w:pPr>
       <w:r>
         <w:rPr>
@@ -690,7 +690,7 @@
       <w:pPr>
         <w:bidi/>
         <w:spacing w:after="60" w:before="120" w:line="360"/>
-        <w:jc w:val="right"/>
+        <w:jc w:val="both"/>
       </w:pPr>
       <w:r>
         <w:rPr>
@@ -719,7 +719,7 @@
       <w:pPr>
         <w:bidi/>
         <w:spacing w:after="240" w:line="360"/>
-        <w:jc w:val="right"/>
+        <w:jc w:val="both"/>
       </w:pPr>
       <w:r>
         <w:rPr>
@@ -746,7 +746,7 @@
       <w:pPr>
         <w:bidi/>
         <w:spacing w:after="60" w:before="120" w:line="360"/>
-        <w:jc w:val="right"/>
+        <w:jc w:val="both"/>
       </w:pPr>
       <w:r>
         <w:rPr>
@@ -775,7 +775,7 @@
       <w:pPr>
         <w:bidi/>
         <w:spacing w:after="240" w:line="360"/>
-        <w:jc w:val="right"/>
+        <w:jc w:val="both"/>
       </w:pPr>
       <w:r>
         <w:rPr>
@@ -802,7 +802,7 @@
       <w:pPr>
         <w:bidi/>
         <w:spacing w:after="60" w:before="120" w:line="360"/>
-        <w:jc w:val="right"/>
+        <w:jc w:val="both"/>
       </w:pPr>
       <w:r>
         <w:rPr>
@@ -831,7 +831,7 @@
       <w:pPr>
         <w:bidi/>
         <w:spacing w:after="240" w:line="360"/>
-        <w:jc w:val="right"/>
+        <w:jc w:val="both"/>
       </w:pPr>
       <w:r>
         <w:rPr>
@@ -858,7 +858,7 @@
       <w:pPr>
         <w:bidi/>
         <w:spacing w:after="60" w:before="120" w:line="360"/>
-        <w:jc w:val="right"/>
+        <w:jc w:val="both"/>
       </w:pPr>
       <w:r>
         <w:rPr>
@@ -887,7 +887,7 @@
       <w:pPr>
         <w:bidi/>
         <w:spacing w:after="240" w:line="360"/>
-        <w:jc w:val="right"/>
+        <w:jc w:val="both"/>
       </w:pPr>
       <w:r>
         <w:rPr>
@@ -914,7 +914,7 @@
       <w:pPr>
         <w:bidi/>
         <w:spacing w:after="120" w:before="240" w:line="360"/>
-        <w:jc w:val="right"/>
+        <w:jc w:val="both"/>
       </w:pPr>
       <w:r>
         <w:rPr>
@@ -933,7 +933,7 @@
       <w:pPr>
         <w:bidi/>
         <w:spacing w:after="60" w:before="120" w:line="360"/>
-        <w:jc w:val="right"/>
+        <w:jc w:val="both"/>
       </w:pPr>
       <w:r>
         <w:rPr>
@@ -962,7 +962,7 @@
       <w:pPr>
         <w:bidi/>
         <w:spacing w:after="240" w:line="360"/>
-        <w:jc w:val="right"/>
+        <w:jc w:val="both"/>
       </w:pPr>
       <w:r>
         <w:rPr>
@@ -989,7 +989,7 @@
       <w:pPr>
         <w:bidi/>
         <w:spacing w:after="60" w:before="120" w:line="360"/>
-        <w:jc w:val="right"/>
+        <w:jc w:val="both"/>
       </w:pPr>
       <w:r>
         <w:rPr>
@@ -1018,7 +1018,7 @@
       <w:pPr>
         <w:bidi/>
         <w:spacing w:after="240" w:line="360"/>
-        <w:jc w:val="right"/>
+        <w:jc w:val="both"/>
       </w:pPr>
       <w:r>
         <w:rPr>
@@ -1045,7 +1045,7 @@
       <w:pPr>
         <w:bidi/>
         <w:spacing w:after="60" w:before="120" w:line="360"/>
-        <w:jc w:val="right"/>
+        <w:jc w:val="both"/>
       </w:pPr>
       <w:r>
         <w:rPr>
@@ -1074,7 +1074,7 @@
       <w:pPr>
         <w:bidi/>
         <w:spacing w:after="240" w:line="360"/>
-        <w:jc w:val="right"/>
+        <w:jc w:val="both"/>
       </w:pPr>
       <w:r>
         <w:rPr>
@@ -1101,7 +1101,7 @@
       <w:pPr>
         <w:bidi/>
         <w:spacing w:after="60" w:before="120" w:line="360"/>
-        <w:jc w:val="right"/>
+        <w:jc w:val="both"/>
       </w:pPr>
       <w:r>
         <w:rPr>
@@ -1130,7 +1130,7 @@
       <w:pPr>
         <w:bidi/>
         <w:spacing w:after="240" w:line="360"/>
-        <w:jc w:val="right"/>
+        <w:jc w:val="both"/>
       </w:pPr>
       <w:r>
         <w:rPr>
@@ -1157,7 +1157,7 @@
       <w:pPr>
         <w:bidi/>
         <w:spacing w:after="120" w:before="240" w:line="360"/>
-        <w:jc w:val="right"/>
+        <w:jc w:val="both"/>
       </w:pPr>
       <w:r>
         <w:rPr>
@@ -1176,7 +1176,7 @@
       <w:pPr>
         <w:bidi/>
         <w:spacing w:after="60" w:before="120" w:line="360"/>
-        <w:jc w:val="right"/>
+        <w:jc w:val="both"/>
       </w:pPr>
       <w:r>
         <w:rPr>
@@ -1205,7 +1205,7 @@
       <w:pPr>
         <w:bidi/>
         <w:spacing w:after="240" w:line="360"/>
-        <w:jc w:val="right"/>
+        <w:jc w:val="both"/>
       </w:pPr>
       <w:r>
         <w:rPr>

</xml_diff>